<commit_message>
feat(performance): actualizar resultados y comparacion shuffle 5.1
</commit_message>
<xml_diff>
--- a/docs/Rendimiento 5.1/DATAMARCA_Informe_Tecnico_Pruebas_Rendimiento_5_1.docx
+++ b/docs/Rendimiento 5.1/DATAMARCA_Informe_Tecnico_Pruebas_Rendimiento_5_1.docx
@@ -39,7 +39,7 @@
         <w:pStyle w:val="ReportMeta"/>
       </w:pPr>
       <w:r>
-        <w:t>Fecha de ejecución: 28 de octubre de 2026  |  Modalidad: benchmark aislado y reproducible</w:t>
+        <w:t>Fecha de actualización: 30 de octubre de 2026  |  Modalidad: benchmark local, comparación de particiones</w:t>
       </w:r>
     </w:p>
     <w:p>
@@ -52,17 +52,17 @@
     </w:p>
     <w:p>
       <w:r>
-        <w:t>Se ejecutaron cinco escenarios de carga con 5.000, 10.000, 25.000, 50.000 y 90.000 registros por cada una de las dos fuentes (transacciones y logs de comercio electrónico). Cada escenario tuvo dos repeticiones, para un total de diez pruebas comparativas; adicionalmente se realizó una prueba piloto de 5.000 registros por fuente.</w:t>
+        <w:t>Se amplió la evaluación de DATAMARCA con cinco volúmenes (5.000, 10.000, 25.000, 50.000 y 90.000 registros por fuente) y dos configuraciones de spark.sql.shuffle.partitions (8 y 200). La campaña comparativa comprende 20 ejecuciones: dos repeticiones por combinación. Se conservaron, además, dos pilotos de 5.000 registros por fuente, separados de las medianas principales.</w:t>
       </w:r>
     </w:p>
     <w:p>
       <w:r>
-        <w:t>Las once ejecuciones finalizaron con estado «ok» y la comprobación de integridad activada. En el escenario máximo se procesaron 180.000 registros de entrada y se conservaron 90.000 transacciones después del join, con igualdad entre la suma de montos antes y después del cruce. La segunda repetición del escenario máximo tardó 9,960 s; la mediana de ambas repeticiones fue 13,298 s.</w:t>
+        <w:t>Las 22 ejecuciones registradas terminaron con estado «ok» e integridad True. Para 90.000 registros por fuente (180.000 registros de entrada), la mediana del tiempo total fue de 9,359 s con 8 particiones frente a 46,629 s con 200. En los cinco tamaños, 8 particiones registró menor tiempo mediano; las reducciones observadas estuvieron entre 65,9 % y 79,9 %.</w:t>
       </w:r>
     </w:p>
     <w:p>
       <w:r>
-        <w:t>El principal hallazgo por fases es el peso de Gold (agregaciones y persistencia) en las ejecuciones estabilizadas. Se observaron advertencias recurrentes de ventanas sin partición y de caché ya existente. Estas señales justifican revisión técnica, pero no constituyen por sí mismas fallos funcionales ni prueban un cuello de botella dominante a mayor escala.</w:t>
+        <w:t>El beneficio de reducir particiones es un hallazgo empírico de este entorno local, no una regla universal. Los tiempos con 8 particiones no crecieron monótonamente con el volumen; el calentamiento de Spark y las características de los datos replicados limitan la interpretación de escalabilidad. Se observaron advertencias WindowExec sobre operaciones de ventana sin partición explícita.</w:t>
       </w:r>
     </w:p>
     <w:p>
@@ -75,7 +75,7 @@
     </w:p>
     <w:p>
       <w:r>
-        <w:t>Evaluar el comportamiento temporal y la consistencia del pipeline DATAMARCA ante aumentos progresivos del volumen de entrada, utilizando las funciones existentes del repositorio y sin modificar el código fuente ni los datos persistidos del proyecto.</w:t>
+        <w:t>Comparar el comportamiento temporal y la consistencia del pipeline DATAMARCA al aumentar el volumen de entrada, contrastando 8 y 200 particiones de shuffle bajo el mismo benchmark y sin modificar las fuentes originales ni los datos persistidos del proyecto.</w:t>
       </w:r>
     </w:p>
     <w:p>
@@ -191,7 +191,7 @@
               <w:rPr>
                 <w:sz w:val="17"/>
               </w:rPr>
-              <w:t>Mac Apple Silicon; 8 GB de RAM; 8 CPU lógicas</w:t>
+              <w:t>Mac Apple Silicon (equipo local descrito en la evaluación inicial)</w:t>
             </w:r>
           </w:p>
         </w:tc>
@@ -287,7 +287,7 @@
               <w:rPr>
                 <w:sz w:val="17"/>
               </w:rPr>
-              <w:t>Spark local[2]; 8 particiones de shuffle; formato Parquet</w:t>
+              <w:t>Spark local[2]; shuffle solicitado: 8 y 200; salida Parquet</w:t>
             </w:r>
           </w:p>
         </w:tc>
@@ -335,7 +335,7 @@
               <w:rPr>
                 <w:sz w:val="17"/>
               </w:rPr>
-              <w:t>CSV de transacciones y JSON de logs, con 5.000 registros originales por fuente</w:t>
+              <w:t>CSV de transacciones y JSON de logs; 5.000 filas originales por fuente</w:t>
             </w:r>
           </w:p>
         </w:tc>
@@ -383,7 +383,7 @@
               <w:rPr>
                 <w:sz w:val="17"/>
               </w:rPr>
-              <w:t>5.000 / 10.000 / 25.000 / 50.000 / 90.000 por fuente; dos repeticiones cada uno</w:t>
+              <w:t>5.000 / 10.000 / 25.000 / 50.000 / 90.000 por fuente; 2 repeticiones por configuración</w:t>
             </w:r>
           </w:p>
         </w:tc>
@@ -431,7 +431,7 @@
               <w:rPr>
                 <w:sz w:val="17"/>
               </w:rPr>
-              <w:t>Archivos de trabajo temporales fuera del repositorio; métricas CSV externas</w:t>
+              <w:t>Archivos temporales fuera del repositorio; CSV de resultados en el directorio personal</w:t>
             </w:r>
           </w:p>
         </w:tc>
@@ -442,12 +442,12 @@
         <w:spacing w:before="160"/>
       </w:pPr>
       <w:r>
-        <w:t>Para ampliar los escenarios se replicaron registros de las fuentes originales, asignando identificadores únicos de transacción y evento; los identificadores de usuario y otras características se conservaron. Por ello, se trata de datos sintéticos escalados, no de nuevas observaciones independientes. La carga se ejecutó con las funciones del proyecto para ingestión y calidad, limpieza, persistencia Silver, join, agregaciones y persistencia Gold.</w:t>
+        <w:t>Los escenarios se construyeron replicando los archivos originales de transacciones (CSV) y logs (JSON), con identificadores de evento/transacción diferenciados. Se conservaron otras distribuciones de los datos base, por lo que la ampliación es sintética y no equivale a observar nuevas transacciones independientes. El benchmark utiliza módulos del proyecto para validar, limpiar, cruzar, agregar y escribir salidas Silver/Gold en Parquet local.</w:t>
       </w:r>
     </w:p>
     <w:p>
       <w:r>
-        <w:t>El tiempo total se midió dentro de cada ejecución del pipeline, no incluye necesariamente la creación de SparkSession ni la generación previa de archivos sintéticos. Las fases medidas fueron: ingestión/calidad, limpieza, Silver, join y Gold. La métrica de transacciones por segundo divide las transacciones procesadas entre el tiempo total; no suma ambas fuentes.</w:t>
+        <w:t>La configuración se pasó mediante la variable SHUFFLE_PARTITIONS=8 o SHUFFLE_PARTITIONS=200 al ejecutar python src/main.py --benchmark. El tiempo total informado se mide dentro del benchmark y no incluye necesariamente la creación de SparkSession ni la generación de archivos sintéticos. Las etapas son ingestión/calidad, limpieza, Silver, join y Gold. Cada combinación se ejecutó dos veces; las dos pruebas piloto se identifican por separado.</w:t>
       </w:r>
     </w:p>
     <w:p>
@@ -496,7 +496,7 @@
                 <w:color w:val="FFFFFF"/>
                 <w:sz w:val="17"/>
               </w:rPr>
-              <w:t>Filas por fuente</w:t>
+              <w:t>Filas/fuente</w:t>
             </w:r>
           </w:p>
         </w:tc>
@@ -542,7 +542,7 @@
                 <w:color w:val="FFFFFF"/>
                 <w:sz w:val="17"/>
               </w:rPr>
-              <w:t>Rep. 1 (s)</w:t>
+              <w:t>Mediana 8 (s)</w:t>
             </w:r>
           </w:p>
         </w:tc>
@@ -565,7 +565,7 @@
                 <w:color w:val="FFFFFF"/>
                 <w:sz w:val="17"/>
               </w:rPr>
-              <w:t>Rep. 2 (s)</w:t>
+              <w:t>Mediana 200 (s)</w:t>
             </w:r>
           </w:p>
         </w:tc>
@@ -588,7 +588,7 @@
                 <w:color w:val="FFFFFF"/>
                 <w:sz w:val="17"/>
               </w:rPr>
-              <w:t>Mediana (s)</w:t>
+              <w:t>Ahorro</w:t>
             </w:r>
           </w:p>
         </w:tc>
@@ -682,7 +682,7 @@
               <w:rPr>
                 <w:sz w:val="17"/>
               </w:rPr>
-              <w:t>14,185</w:t>
+              <w:t>10,752</w:t>
             </w:r>
           </w:p>
         </w:tc>
@@ -705,7 +705,7 @@
               <w:rPr>
                 <w:sz w:val="17"/>
               </w:rPr>
-              <w:t>7,133</w:t>
+              <w:t>31,570</w:t>
             </w:r>
           </w:p>
         </w:tc>
@@ -728,7 +728,7 @@
               <w:rPr>
                 <w:sz w:val="17"/>
               </w:rPr>
-              <w:t>10,659</w:t>
+              <w:t>65,9 %</w:t>
             </w:r>
           </w:p>
         </w:tc>
@@ -822,7 +822,7 @@
               <w:rPr>
                 <w:sz w:val="17"/>
               </w:rPr>
-              <w:t>7,099</w:t>
+              <w:t>11,431</w:t>
             </w:r>
           </w:p>
         </w:tc>
@@ -845,7 +845,7 @@
               <w:rPr>
                 <w:sz w:val="17"/>
               </w:rPr>
-              <w:t>6,600</w:t>
+              <w:t>34,914</w:t>
             </w:r>
           </w:p>
         </w:tc>
@@ -868,7 +868,7 @@
               <w:rPr>
                 <w:sz w:val="17"/>
               </w:rPr>
-              <w:t>6,850</w:t>
+              <w:t>67,3 %</w:t>
             </w:r>
           </w:p>
         </w:tc>
@@ -962,7 +962,7 @@
               <w:rPr>
                 <w:sz w:val="17"/>
               </w:rPr>
-              <w:t>7,226</w:t>
+              <w:t>7,903</w:t>
             </w:r>
           </w:p>
         </w:tc>
@@ -985,7 +985,7 @@
               <w:rPr>
                 <w:sz w:val="17"/>
               </w:rPr>
-              <w:t>7,098</w:t>
+              <w:t>35,273</w:t>
             </w:r>
           </w:p>
         </w:tc>
@@ -1008,7 +1008,7 @@
               <w:rPr>
                 <w:sz w:val="17"/>
               </w:rPr>
-              <w:t>7,162</w:t>
+              <w:t>77,6 %</w:t>
             </w:r>
           </w:p>
         </w:tc>
@@ -1102,7 +1102,7 @@
               <w:rPr>
                 <w:sz w:val="17"/>
               </w:rPr>
-              <w:t>13,931</w:t>
+              <w:t>12,056</w:t>
             </w:r>
           </w:p>
         </w:tc>
@@ -1125,7 +1125,7 @@
               <w:rPr>
                 <w:sz w:val="17"/>
               </w:rPr>
-              <w:t>8,204</w:t>
+              <w:t>45,801</w:t>
             </w:r>
           </w:p>
         </w:tc>
@@ -1148,7 +1148,7 @@
               <w:rPr>
                 <w:sz w:val="17"/>
               </w:rPr>
-              <w:t>11,067</w:t>
+              <w:t>73,7 %</w:t>
             </w:r>
           </w:p>
         </w:tc>
@@ -1242,7 +1242,7 @@
               <w:rPr>
                 <w:sz w:val="17"/>
               </w:rPr>
-              <w:t>16,635</w:t>
+              <w:t>9,359</w:t>
             </w:r>
           </w:p>
         </w:tc>
@@ -1265,7 +1265,7 @@
               <w:rPr>
                 <w:sz w:val="17"/>
               </w:rPr>
-              <w:t>9,960</w:t>
+              <w:t>46,629</w:t>
             </w:r>
           </w:p>
         </w:tc>
@@ -1288,7 +1288,7 @@
               <w:rPr>
                 <w:sz w:val="17"/>
               </w:rPr>
-              <w:t>13,298</w:t>
+              <w:t>79,9 %</w:t>
             </w:r>
           </w:p>
         </w:tc>
@@ -1325,8 +1325,8 @@
       <w:r>
         <w:drawing>
           <wp:inline xmlns:a="http://schemas.openxmlformats.org/drawingml/2006/main" xmlns:pic="http://schemas.openxmlformats.org/drawingml/2006/picture">
-            <wp:extent cx="5349240" cy="2036587"/>
-            <wp:docPr id="1" name="Picture 1"/>
+            <wp:extent cx="5349240" cy="2235461"/>
+            <wp:docPr id="3" name="Picture 3"/>
             <wp:cNvGraphicFramePr>
               <a:graphicFrameLocks noChangeAspect="1"/>
             </wp:cNvGraphicFramePr>
@@ -1338,7 +1338,7 @@
                     <pic:cNvPicPr/>
                   </pic:nvPicPr>
                   <pic:blipFill>
-                    <a:blip r:embed="rId10"/>
+                    <a:blip r:embed="rId12"/>
                     <a:stretch>
                       <a:fillRect/>
                     </a:stretch>
@@ -1346,7 +1346,7 @@
                   <pic:spPr>
                     <a:xfrm>
                       <a:off x="0" y="0"/>
-                      <a:ext cx="5349240" cy="2036587"/>
+                      <a:ext cx="5349240" cy="2235461"/>
                     </a:xfrm>
                     <a:prstGeom prst="rect"/>
                   </pic:spPr>
@@ -1363,19 +1363,62 @@
         <w:jc w:val="center"/>
       </w:pPr>
       <w:r>
-        <w:t>Figura 1. Comparación entre mediana de dos repeticiones y segunda ejecución de cada escenario.</w:t>
+        <w:t>Figura 1. Mediana de tiempo total por volumen y configuración de shuffle (n=2 por punto).</w:t>
       </w:r>
     </w:p>
     <w:p>
       <w:r>
-        <w:t>El tiempo mediano disminuye entre 5.000 y 10.000 filas por fuente, efecto que no debe interpretarse como una mejora causada por añadir registros: la primera repetición del escenario base contiene un costo de calentamiento considerable. En la segunda repetición, el tiempo pasa de 7,133 s (5.000) a 9,960 s (90.000), incremento de 39,6 % ante un volumen de entrada 18 veces mayor. El resultado describe este entorno y rango, sin permitir extrapolación a cargas de producción.</w:t>
+        <w:t>Para 5.000 filas por fuente, la mediana fue de 10,752 s con 8 particiones y 31,570 s con 200; para 90.000, de 9,359 s y 46,629 s, respectivamente. El tiempo de 8 particiones fluctúa entre tamaños y no permite inferir escalado lineal ni una mejora causada por aumentar los datos. Las mediciones incluyen variación entre primera y segunda repetición, y el orden de configuraciones no fue aleatorizado.</w:t>
       </w:r>
     </w:p>
     <w:p>
+      <w:pPr>
+        <w:jc w:val="center"/>
+      </w:pPr>
       <w:r>
-        <w:br w:type="page"/>
+        <w:drawing>
+          <wp:inline xmlns:a="http://schemas.openxmlformats.org/drawingml/2006/main" xmlns:pic="http://schemas.openxmlformats.org/drawingml/2006/picture">
+            <wp:extent cx="3703320" cy="1265170"/>
+            <wp:docPr id="5" name="Picture 5"/>
+            <wp:cNvGraphicFramePr>
+              <a:graphicFrameLocks noChangeAspect="1"/>
+            </wp:cNvGraphicFramePr>
+            <a:graphic>
+              <a:graphicData uri="http://schemas.openxmlformats.org/drawingml/2006/picture">
+                <pic:pic>
+                  <pic:nvPicPr>
+                    <pic:cNvPr id="0" name="datamarca_5_1_rendimiento.png"/>
+                    <pic:cNvPicPr/>
+                  </pic:nvPicPr>
+                  <pic:blipFill>
+                    <a:blip r:embed="rId14"/>
+                    <a:stretch>
+                      <a:fillRect/>
+                    </a:stretch>
+                  </pic:blipFill>
+                  <pic:spPr>
+                    <a:xfrm>
+                      <a:off x="0" y="0"/>
+                      <a:ext cx="3703320" cy="1265170"/>
+                    </a:xfrm>
+                    <a:prstGeom prst="rect"/>
+                  </pic:spPr>
+                </pic:pic>
+              </a:graphicData>
+            </a:graphic>
+          </wp:inline>
+        </w:drawing>
       </w:r>
     </w:p>
+    <w:p>
+      <w:pPr>
+        <w:pStyle w:val="FigureCaption"/>
+      </w:pPr>
+      <w:r>
+        <w:t>Figura 2. Factor de aceleración mediano de 8 frente a 200 particiones.</w:t>
+      </w:r>
+    </w:p>
+    <w:p/>
     <w:p>
       <w:pPr>
         <w:pStyle w:val="Heading1"/>
@@ -1386,7 +1429,7 @@
     </w:p>
     <w:p>
       <w:r>
-        <w:t>La tabla siguiente presenta exclusivamente la segunda repetición de cada escenario, útil como comparación exploratoria después de la primera ejecución de cada sesión. Los tiempos están expresados en segundos.</w:t>
+        <w:t>El cuadro muestra las medianas de duración de cada etapa para la configuración de 8 particiones. Son medianas calculadas por fase de forma independiente y no necesariamente suman exactamente la mediana del tiempo total. La figura siguiente contrasta las fases de 8 y 200 particiones en el volumen máximo.</w:t>
       </w:r>
     </w:p>
     <w:tbl>
@@ -1590,7 +1633,7 @@
               <w:rPr>
                 <w:sz w:val="17"/>
               </w:rPr>
-              <w:t>1,151</w:t>
+              <w:t>2,986</w:t>
             </w:r>
           </w:p>
         </w:tc>
@@ -1613,7 +1656,7 @@
               <w:rPr>
                 <w:sz w:val="17"/>
               </w:rPr>
-              <w:t>0,350</w:t>
+              <w:t>0,481</w:t>
             </w:r>
           </w:p>
         </w:tc>
@@ -1636,7 +1679,7 @@
               <w:rPr>
                 <w:sz w:val="17"/>
               </w:rPr>
-              <w:t>1,619</w:t>
+              <w:t>2,331</w:t>
             </w:r>
           </w:p>
         </w:tc>
@@ -1659,7 +1702,7 @@
               <w:rPr>
                 <w:sz w:val="17"/>
               </w:rPr>
-              <w:t>0,505</w:t>
+              <w:t>0,633</w:t>
             </w:r>
           </w:p>
         </w:tc>
@@ -1682,7 +1725,7 @@
               <w:rPr>
                 <w:sz w:val="17"/>
               </w:rPr>
-              <w:t>3,508</w:t>
+              <w:t>4,320</w:t>
             </w:r>
           </w:p>
         </w:tc>
@@ -1730,7 +1773,7 @@
               <w:rPr>
                 <w:sz w:val="17"/>
               </w:rPr>
-              <w:t>0,988</w:t>
+              <w:t>3,262</w:t>
             </w:r>
           </w:p>
         </w:tc>
@@ -1753,7 +1796,7 @@
               <w:rPr>
                 <w:sz w:val="17"/>
               </w:rPr>
-              <w:t>0,357</w:t>
+              <w:t>0,567</w:t>
             </w:r>
           </w:p>
         </w:tc>
@@ -1776,7 +1819,7 @@
               <w:rPr>
                 <w:sz w:val="17"/>
               </w:rPr>
-              <w:t>1,563</w:t>
+              <w:t>2,721</w:t>
             </w:r>
           </w:p>
         </w:tc>
@@ -1799,7 +1842,7 @@
               <w:rPr>
                 <w:sz w:val="17"/>
               </w:rPr>
-              <w:t>0,481</w:t>
+              <w:t>0,754</w:t>
             </w:r>
           </w:p>
         </w:tc>
@@ -1822,7 +1865,7 @@
               <w:rPr>
                 <w:sz w:val="17"/>
               </w:rPr>
-              <w:t>3,211</w:t>
+              <w:t>4,127</w:t>
             </w:r>
           </w:p>
         </w:tc>
@@ -1870,7 +1913,7 @@
               <w:rPr>
                 <w:sz w:val="17"/>
               </w:rPr>
-              <w:t>1,282</w:t>
+              <w:t>1,312</w:t>
             </w:r>
           </w:p>
         </w:tc>
@@ -1893,7 +1936,7 @@
               <w:rPr>
                 <w:sz w:val="17"/>
               </w:rPr>
-              <w:t>0,406</w:t>
+              <w:t>0,449</w:t>
             </w:r>
           </w:p>
         </w:tc>
@@ -1916,7 +1959,7 @@
               <w:rPr>
                 <w:sz w:val="17"/>
               </w:rPr>
-              <w:t>1,699</w:t>
+              <w:t>1,730</w:t>
             </w:r>
           </w:p>
         </w:tc>
@@ -1939,7 +1982,7 @@
               <w:rPr>
                 <w:sz w:val="17"/>
               </w:rPr>
-              <w:t>0,481</w:t>
+              <w:t>0,592</w:t>
             </w:r>
           </w:p>
         </w:tc>
@@ -1962,7 +2005,7 @@
               <w:rPr>
                 <w:sz w:val="17"/>
               </w:rPr>
-              <w:t>3,229</w:t>
+              <w:t>3,820</w:t>
             </w:r>
           </w:p>
         </w:tc>
@@ -2010,7 +2053,7 @@
               <w:rPr>
                 <w:sz w:val="17"/>
               </w:rPr>
-              <w:t>1,823</w:t>
+              <w:t>4,025</w:t>
             </w:r>
           </w:p>
         </w:tc>
@@ -2033,7 +2076,7 @@
               <w:rPr>
                 <w:sz w:val="17"/>
               </w:rPr>
-              <w:t>0,533</w:t>
+              <w:t>0,702</w:t>
             </w:r>
           </w:p>
         </w:tc>
@@ -2056,7 +2099,7 @@
               <w:rPr>
                 <w:sz w:val="17"/>
               </w:rPr>
-              <w:t>1,731</w:t>
+              <w:t>2,549</w:t>
             </w:r>
           </w:p>
         </w:tc>
@@ -2079,7 +2122,7 @@
               <w:rPr>
                 <w:sz w:val="17"/>
               </w:rPr>
-              <w:t>0,721</w:t>
+              <w:t>0,825</w:t>
             </w:r>
           </w:p>
         </w:tc>
@@ -2102,7 +2145,7 @@
               <w:rPr>
                 <w:sz w:val="17"/>
               </w:rPr>
-              <w:t>3,396</w:t>
+              <w:t>3,954</w:t>
             </w:r>
           </w:p>
         </w:tc>
@@ -2150,7 +2193,7 @@
               <w:rPr>
                 <w:sz w:val="17"/>
               </w:rPr>
-              <w:t>2,550</w:t>
+              <w:t>2,162</w:t>
             </w:r>
           </w:p>
         </w:tc>
@@ -2173,7 +2216,7 @@
               <w:rPr>
                 <w:sz w:val="17"/>
               </w:rPr>
-              <w:t>0,773</w:t>
+              <w:t>0,675</w:t>
             </w:r>
           </w:p>
         </w:tc>
@@ -2196,7 +2239,7 @@
               <w:rPr>
                 <w:sz w:val="17"/>
               </w:rPr>
-              <w:t>2,076</w:t>
+              <w:t>2,019</w:t>
             </w:r>
           </w:p>
         </w:tc>
@@ -2219,7 +2262,7 @@
               <w:rPr>
                 <w:sz w:val="17"/>
               </w:rPr>
-              <w:t>0,874</w:t>
+              <w:t>0,859</w:t>
             </w:r>
           </w:p>
         </w:tc>
@@ -2242,7 +2285,7 @@
               <w:rPr>
                 <w:sz w:val="17"/>
               </w:rPr>
-              <w:t>3,687</w:t>
+              <w:t>3,643</w:t>
             </w:r>
           </w:p>
         </w:tc>
@@ -2256,8 +2299,8 @@
       <w:r>
         <w:drawing>
           <wp:inline xmlns:a="http://schemas.openxmlformats.org/drawingml/2006/main" xmlns:pic="http://schemas.openxmlformats.org/drawingml/2006/picture">
-            <wp:extent cx="5349240" cy="2173129"/>
-            <wp:docPr id="2" name="Picture 2"/>
+            <wp:extent cx="5349240" cy="2187295"/>
+            <wp:docPr id="4" name="Picture 4"/>
             <wp:cNvGraphicFramePr>
               <a:graphicFrameLocks noChangeAspect="1"/>
             </wp:cNvGraphicFramePr>
@@ -2269,7 +2312,7 @@
                     <pic:cNvPicPr/>
                   </pic:nvPicPr>
                   <pic:blipFill>
-                    <a:blip r:embed="rId11"/>
+                    <a:blip r:embed="rId13"/>
                     <a:stretch>
                       <a:fillRect/>
                     </a:stretch>
@@ -2277,7 +2320,7 @@
                   <pic:spPr>
                     <a:xfrm>
                       <a:off x="0" y="0"/>
-                      <a:ext cx="5349240" cy="2173129"/>
+                      <a:ext cx="5349240" cy="2187295"/>
                     </a:xfrm>
                     <a:prstGeom prst="rect"/>
                   </pic:spPr>
@@ -2294,17 +2337,17 @@
         <w:jc w:val="center"/>
       </w:pPr>
       <w:r>
-        <w:t>Figura 2. Composición del tiempo total por fase en la segunda repetición.</w:t>
+        <w:t>Figura 3. Desglose de tiempos por etapa para 90.000 filas por fuente; medianas de dos repeticiones.</w:t>
       </w:r>
     </w:p>
     <w:p>
       <w:r>
-        <w:t>Gold fue la fase de mayor duración en los cinco escenarios de segunda repetición: de 3,211 a 3,687 s. En 90.000 registros por fuente representó aproximadamente 37,0 % del tiempo total (3,687/9,960 s), seguida de ingestión/calidad con 25,6 %. La limpieza y el join tuvieron una contribución menor dentro del rango medido. El análisis es descriptivo; no separa cómputo de agregaciones de escritura de cada tabla Gold.</w:t>
+        <w:t>En el escenario de 90.000 filas por fuente, la fase Gold tuvo una mediana de 3,643 s con 8 particiones y 27,013 s con 200. Equivale aproximadamente al 38,9 % y 57,9 % de sus respectivas medianas de tiempo total. El mayor costo de Gold bajo 200 particiones sugiere un foco de perfilado, pero no demuestra por sí solo qué operación física explica la diferencia.</w:t>
       </w:r>
     </w:p>
     <w:p>
       <w:r>
-        <w:t>La productividad observada en la segunda repetición pasó de 701 a 9.036 transacciones por segundo entre el escenario mínimo y el máximo. Esta tasa usa únicamente transacciones en el numerador y debe interpretarse junto con el tiempo total y la naturaleza sintética de los datos.</w:t>
+        <w:t>La productividad (transacciones de entrada divididas por tiempo total) también aumenta con 8 particiones en este equipo. No obstante, las diferencias entre ejecuciones, la posible adaptación de Spark y la reutilización de patrones sintéticos impiden extrapolar estos valores a un clúster o a cargas de producción.</w:t>
       </w:r>
     </w:p>
     <w:p>
@@ -2317,12 +2360,12 @@
     </w:p>
     <w:p>
       <w:r>
-        <w:t>En los cinco escenarios, los conteos de transacciones y logs válidos coincidieron con los conteos de entrada; no se enviaron registros a cuarentena. El join produjo tantas filas como transacciones limpias y mantuvo la suma de amount_cop. La comprobación del benchmark cubre conteos y montos; no constituye una auditoría completa de equivalencia semántica de todas las columnas.</w:t>
+        <w:t>En las 22 ejecuciones, los CSV registran status=ok e integrity_ok=True. Los conteos de transacciones y logs válidos coinciden con los de entrada; el join conserva el número de transacciones y la suma amount_tx coincide con amount_join. Esta verificación cubre los invariantes incluidos en el benchmark, pero no certifica toda la semántica del pipeline de producción.</w:t>
       </w:r>
     </w:p>
     <w:p>
       <w:r>
-        <w:t>Se reportaron advertencias T-D02 para product_category (19,66 % de las transacciones) y T-D04 para montos extremos (aproximadamente 0,96 %–1,10 % según escenario). Son advertencias de calidad, no rechazos. Dado que los datos fueron replicados, su frecuencia no debe interpretarse como una estimación independiente de la calidad de una población mayor.</w:t>
+        <w:t>Las advertencias de calidad descritas en el informe inicial (por ejemplo, categorías o montos atípicos) no se cuantifican en los ocho CSV de esta campaña. Por ello, aquí no se atribuyen nuevas tasas de advertencia. La ausencia de fallos de integridad no equivale a ausencia de observaciones de calidad.</w:t>
       </w:r>
     </w:p>
     <w:p>
@@ -2415,7 +2458,7 @@
               <w:rPr>
                 <w:sz w:val="17"/>
               </w:rPr>
-              <w:t>WindowExec: No Partition Defined</w:t>
+              <w:t>WindowExec sin partición</w:t>
             </w:r>
           </w:p>
         </w:tc>
@@ -2438,7 +2481,7 @@
               <w:rPr>
                 <w:sz w:val="17"/>
               </w:rPr>
-              <w:t>Revisar las ventanas de ranking/top y su plan físico con explain(). Determinar si requieren una ventana global por definición de negocio; no añadir particiones sin validar el resultado.</w:t>
+              <w:t>Revisar operaciones de ventana y plan físico; puede forzar procesamiento en una partición.</w:t>
             </w:r>
           </w:p>
         </w:tc>
@@ -2463,7 +2506,7 @@
               <w:rPr>
                 <w:sz w:val="17"/>
               </w:rPr>
-              <w:t>CacheManager: already cached</w:t>
+              <w:t>Variabilidad entre repeticiones</w:t>
             </w:r>
           </w:p>
         </w:tc>
@@ -2486,7 +2529,7 @@
               <w:rPr>
                 <w:sz w:val="17"/>
               </w:rPr>
-              <w:t>Revisar los puntos de cache()/persist() y unpersist() para evitar materializaciones redundantes.</w:t>
+              <w:t>Separar corridas frías/calientes y aleatorizar orden; comparar más de dos repeticiones.</w:t>
             </w:r>
           </w:p>
         </w:tc>
@@ -2511,7 +2554,7 @@
               <w:rPr>
                 <w:sz w:val="17"/>
               </w:rPr>
-              <w:t>Calentamiento entre repeticiones</w:t>
+              <w:t>Gold más costoso con 200</w:t>
             </w:r>
           </w:p>
         </w:tc>
@@ -2534,7 +2577,7 @@
               <w:rPr>
                 <w:sz w:val="17"/>
               </w:rPr>
-              <w:t>Separar arranque/caliente; realizar más repeticiones por escenario y alternar el orden de tamaños.</w:t>
+              <w:t>Perfilar agregaciones, acciones y escritura; revisar número de tareas y particiones efectivas.</w:t>
             </w:r>
           </w:p>
         </w:tc>
@@ -2559,7 +2602,7 @@
               <w:rPr>
                 <w:sz w:val="17"/>
               </w:rPr>
-              <w:t>Gold concentra tiempo</w:t>
+              <w:t>Shuffle no es partición de salida</w:t>
             </w:r>
           </w:p>
         </w:tc>
@@ -2582,7 +2625,7 @@
               <w:rPr>
                 <w:sz w:val="17"/>
               </w:rPr>
-              <w:t>Perfilar por agregado y por escritura Gold; evaluar cantidad de acciones Spark, recomputaciones y particionado de salida.</w:t>
+              <w:t>Las salidas Gold de una partición no verifican por sí solas el valor de shuffle; inspeccionar Spark UI.</w:t>
             </w:r>
           </w:p>
         </w:tc>
@@ -2602,7 +2645,7 @@
         <w:spacing w:after="60"/>
       </w:pPr>
       <w:r>
-        <w:t>Se usaron dos repeticiones por tamaño y una única máquina local; no hay intervalos de confianza ni evidencia sobre comportamiento en un clúster.</w:t>
+        <w:t>Se dispone de dos repeticiones comparativas por combinación, más dos pilotos de 5.000 filas; la muestra es pequeña y no se estiman intervalos de confianza.</w:t>
       </w:r>
     </w:p>
     <w:p>
@@ -2611,7 +2654,7 @@
         <w:spacing w:after="60"/>
       </w:pPr>
       <w:r>
-        <w:t>Los escenarios de 50.000 y 90.000 se ejecutaron en sesiones separadas de Spark. La mediana combina una ejecución inicial y otra posterior, por lo que el calentamiento influye en la comparación.</w:t>
+        <w:t>Las configuraciones se ejecutaron en sesiones distintas y en un orden no aleatorizado; la variación entre repeticiones y el calentamiento de Spark pueden afectar la comparación.</w:t>
       </w:r>
     </w:p>
     <w:p>
@@ -2620,7 +2663,7 @@
         <w:spacing w:after="60"/>
       </w:pPr>
       <w:r>
-        <w:t>La ampliación sintética replica registros y conserva la distribución temporal, usuarios y categorías originales; no simula necesariamente cardinalidades, skew o diversidad de datos de producción.</w:t>
+        <w:t>La ampliación sintética repite patrones de transacciones, fechas, usuarios y categorías; no reproduce necesariamente la cardinalidad, el sesgo de claves o la variabilidad de un entorno real.</w:t>
       </w:r>
     </w:p>
     <w:p>
@@ -2629,7 +2672,7 @@
         <w:spacing w:after="60"/>
       </w:pPr>
       <w:r>
-        <w:t>No se capturaron métricas de memoria pico, CPU, spill, número de tareas o tamaño físico de Parquet; no se pueden atribuir causalmente los cambios a un recurso específico.</w:t>
+        <w:t>Los CSV registran tiempos por fase, pero no memoria pico, CPU, spill, distribución de tareas ni planes físicos; no es posible atribuir causalmente el resultado a un recurso concreto.</w:t>
       </w:r>
     </w:p>
     <w:p>
@@ -2638,7 +2681,7 @@
         <w:spacing w:after="60"/>
       </w:pPr>
       <w:r>
-        <w:t>Las pruebas se realizaron con Parquet y Spark local; los resultados no deben atribuirse a Azure, Delta Lake ni a un entorno distribuido si estos no fueron ejecutados.</w:t>
+        <w:t>El experimento corresponde a Spark local y escritura Parquet; no valida directamente infraestructura Azure, Delta Lake ni escalabilidad distribuida. El conteo de particiones de los archivos Gold no equivale al valor configurado para shuffle.</w:t>
       </w:r>
     </w:p>
     <w:p>
@@ -2651,12 +2694,12 @@
     </w:p>
     <w:p>
       <w:r>
-        <w:t>Dentro del entorno de prueba, DATAMARCA completó satisfactoriamente el procesamiento de hasta 180.000 registros de entrada sin rechazos críticos y manteniendo las comprobaciones de conteos y montos del join. El tiempo de la segunda repetición del escenario máximo fue de 9,960 s. Estos resultados sustentan viabilidad funcional y un comportamiento temporal favorable para el rango estudiado, no una garantía de escalabilidad ilimitada.</w:t>
+        <w:t>DATAMARCA completó correctamente las 22 ejecuciones de esta campaña, incluyendo hasta 180.000 registros de entrada por escenario. En los cinco volúmenes, 8 particiones obtuvo menores tiempos medianos que 200, con reducciones observadas de 65,9 % a 79,9 %. La comparación es válida como evidencia local para esta configuración, sin establecer un óptimo general ni una curva de escalabilidad extrapolable.</w:t>
       </w:r>
     </w:p>
     <w:p>
       <w:r>
-        <w:t>Como trabajo posterior se recomienda: (1) perfilar las salidas Gold y sus operaciones de ventana; (2) revisar el ciclo de vida de caché; (3) ejecutar una campaña de benchmarking más robusta con repeticiones adicionales, orden aleatorio de tamaños y métricas Spark; y (4) validar la escalabilidad en infraestructura equivalente a producción. Las recomendaciones no requieren alterar el repositorio para documentar la presente entrega.</w:t>
+        <w:t>Se recomienda: (1) probar otras configuraciones intermedias (p. ej., 16, 32 y 64); (2) repetir las pruebas con orden aleatorizado y mayor número de corridas; (3) perfilar las operaciones de ventana y las escrituras Gold con explain() y Spark UI; (4) capturar CPU, memoria, spill y tareas; y (5) validar la configuración elegida con datos y recursos representativos de producción.</w:t>
       </w:r>
     </w:p>
     <w:p>
@@ -2669,12 +2712,12 @@
     </w:p>
     <w:p>
       <w:r>
-        <w:t>Archivos de resultados: benchmark_datamarca_5_1.csv (piloto); benchmark_datamarca_5_1_escalado.csv (5.000–25.000); benchmark_datamarca_5_1_50000.csv; benchmark_datamarca_5_1_90000.csv. Se adjunta adicionalmente DATAMARCA_5_1_resultados_consolidados.csv con las once filas y referencia al archivo de origen.</w:t>
+        <w:t>Evidencias nuevas: DATAMARCA_5_1_resultados_consolidados.csv (22 filas, incluye pilotos y procedencia) y DATAMARCA_5_1_resumen_comparativo.csv (10 combinaciones, pilotos excluidos). Figuras: datamarca_5_1_tiempos.png, datamarca_5_1_rendimiento.png y datamarca_5_1_etapas.png. Los ocho CSV originales se conservaron como respaldo de los valores calculados.</w:t>
       </w:r>
     </w:p>
     <w:p>
       <w:r>
-        <w:t>Instrumento: benchmark_5_1.py, ejecutado fuera del repositorio y sobre los módulos locales del proyecto BIG-DATA. No se realizaron operaciones git add, commit o push, ni modificaciones del código del repositorio durante esta evaluación.</w:t>
+        <w:t>Instrumento: src/performance/benchmark_5_1.py, invocado mediante python src/main.py --benchmark con SHUFFLE_PARTITIONS=8 o 200. El código y el informe inicial ya se habían incorporado a la rama joel; esta actualización documental no modifica la rama main ni ejecuta operaciones de Git.</w:t>
       </w:r>
     </w:p>
     <w:sectPr>
@@ -2700,7 +2743,7 @@
         <w:color w:val="7D8792"/>
         <w:sz w:val="16"/>
       </w:rPr>
-      <w:t>DATAMARCA  |  Evaluación de rendimiento 5.1  |  28 de octubre de 2026</w:t>
+      <w:t>DATAMARCA  |  Evaluación de rendimiento 5.1  |  30 de octubre de 2026</w:t>
     </w:r>
   </w:p>
 </w:ftr>

</xml_diff>

<commit_message>
test(performance): agregar evidencia de carga 3x P2
</commit_message>
<xml_diff>
--- a/docs/Rendimiento 5.1/DATAMARCA_Informe_Tecnico_Pruebas_Rendimiento_5_1.docx
+++ b/docs/Rendimiento 5.1/DATAMARCA_Informe_Tecnico_Pruebas_Rendimiento_5_1.docx
@@ -2720,6 +2720,306 @@
         <w:t>Instrumento: src/performance/benchmark_5_1.py, invocado mediante python src/main.py --benchmark con SHUFFLE_PARTITIONS=8 o 200. El código y el informe inicial ya se habían incorporado a la rama joel; esta actualización documental no modifica la rama main ni ejecuta operaciones de Git.</w:t>
       </w:r>
     </w:p>
+    <w:p>
+      <w:r>
+        <w:br w:type="page"/>
+      </w:r>
+    </w:p>
+    <w:p>
+      <w:pPr>
+        <w:pStyle w:val="Heading1"/>
+      </w:pPr>
+      <w:r>
+        <w:t>Anexo A. Prueba P2: incremento de carga 3x</w:t>
+      </w:r>
+    </w:p>
+    <w:p>
+      <w:r>
+        <w:t>Propósito. Complementar la evaluación de volumen del punto 5.1 con la comparación explícita exigida por la prueba P2 del diseño: una carga base (1x) frente a una carga triple (3x).</w:t>
+      </w:r>
+    </w:p>
+    <w:p>
+      <w:r>
+        <w:t>Procedimiento. Se ejecutó el benchmark local en PySpark con 8 particiones de shuffle, dos repeticiones por volumen y archivos sintéticos derivados de las mismas fuentes CSV y JSON. La carga base fue de 5.000 transacciones y 5.000 logs; la carga 3x fue de 15.000 transacciones y 15.000 logs. Las mediciones P2 se almacenaron en un CSV independiente; no forman parte de las 22 corridas de la campaña comparativa principal.</w:t>
+      </w:r>
+    </w:p>
+    <w:tbl>
+      <w:tblPr>
+        <w:tblStyle w:val="TableGrid"/>
+        <w:tblW w:type="auto" w:w="0"/>
+        <w:tblLook w:firstColumn="1" w:firstRow="1" w:lastColumn="0" w:lastRow="0" w:noHBand="0" w:noVBand="1" w:val="04A0"/>
+      </w:tblPr>
+      <w:tblGrid>
+        <w:gridCol w:w="1941"/>
+        <w:gridCol w:w="1941"/>
+        <w:gridCol w:w="1941"/>
+        <w:gridCol w:w="1941"/>
+        <w:gridCol w:w="1941"/>
+      </w:tblGrid>
+      <w:tr>
+        <w:tc>
+          <w:tcPr>
+            <w:tcW w:type="dxa" w:w="1941"/>
+          </w:tcPr>
+          <w:p>
+            <w:r>
+              <w:rPr>
+                <w:sz w:val="17"/>
+              </w:rPr>
+              <w:t>Escenario</w:t>
+            </w:r>
+          </w:p>
+        </w:tc>
+        <w:tc>
+          <w:tcPr>
+            <w:tcW w:type="dxa" w:w="1941"/>
+          </w:tcPr>
+          <w:p>
+            <w:r>
+              <w:rPr>
+                <w:sz w:val="17"/>
+              </w:rPr>
+              <w:t>Tx + logs</w:t>
+            </w:r>
+          </w:p>
+        </w:tc>
+        <w:tc>
+          <w:tcPr>
+            <w:tcW w:type="dxa" w:w="1941"/>
+          </w:tcPr>
+          <w:p>
+            <w:r>
+              <w:rPr>
+                <w:sz w:val="17"/>
+              </w:rPr>
+              <w:t>Corrida 1 (s)</w:t>
+            </w:r>
+          </w:p>
+        </w:tc>
+        <w:tc>
+          <w:tcPr>
+            <w:tcW w:type="dxa" w:w="1941"/>
+          </w:tcPr>
+          <w:p>
+            <w:r>
+              <w:rPr>
+                <w:sz w:val="17"/>
+              </w:rPr>
+              <w:t>Corrida 2 (s)</w:t>
+            </w:r>
+          </w:p>
+        </w:tc>
+        <w:tc>
+          <w:tcPr>
+            <w:tcW w:type="dxa" w:w="1941"/>
+          </w:tcPr>
+          <w:p>
+            <w:r>
+              <w:rPr>
+                <w:sz w:val="17"/>
+              </w:rPr>
+              <w:t>Mediana (s)</w:t>
+            </w:r>
+          </w:p>
+        </w:tc>
+      </w:tr>
+      <w:tr>
+        <w:tc>
+          <w:tcPr>
+            <w:tcW w:type="dxa" w:w="1941"/>
+          </w:tcPr>
+          <w:p>
+            <w:r>
+              <w:rPr>
+                <w:sz w:val="17"/>
+              </w:rPr>
+              <w:t>Base 1x</w:t>
+            </w:r>
+          </w:p>
+        </w:tc>
+        <w:tc>
+          <w:tcPr>
+            <w:tcW w:type="dxa" w:w="1941"/>
+          </w:tcPr>
+          <w:p>
+            <w:r>
+              <w:rPr>
+                <w:sz w:val="17"/>
+              </w:rPr>
+              <w:t>5,000 + 5,000</w:t>
+            </w:r>
+          </w:p>
+        </w:tc>
+        <w:tc>
+          <w:tcPr>
+            <w:tcW w:type="dxa" w:w="1941"/>
+          </w:tcPr>
+          <w:p>
+            <w:r>
+              <w:rPr>
+                <w:sz w:val="17"/>
+              </w:rPr>
+              <w:t>12.960</w:t>
+            </w:r>
+          </w:p>
+        </w:tc>
+        <w:tc>
+          <w:tcPr>
+            <w:tcW w:type="dxa" w:w="1941"/>
+          </w:tcPr>
+          <w:p>
+            <w:r>
+              <w:rPr>
+                <w:sz w:val="17"/>
+              </w:rPr>
+              <w:t>7.471</w:t>
+            </w:r>
+          </w:p>
+        </w:tc>
+        <w:tc>
+          <w:tcPr>
+            <w:tcW w:type="dxa" w:w="1941"/>
+          </w:tcPr>
+          <w:p>
+            <w:r>
+              <w:rPr>
+                <w:sz w:val="17"/>
+              </w:rPr>
+              <w:t>10.2155</w:t>
+            </w:r>
+          </w:p>
+        </w:tc>
+      </w:tr>
+      <w:tr>
+        <w:tc>
+          <w:tcPr>
+            <w:tcW w:type="dxa" w:w="1941"/>
+          </w:tcPr>
+          <w:p>
+            <w:r>
+              <w:rPr>
+                <w:sz w:val="17"/>
+              </w:rPr>
+              <w:t>Carga 3x</w:t>
+            </w:r>
+          </w:p>
+        </w:tc>
+        <w:tc>
+          <w:tcPr>
+            <w:tcW w:type="dxa" w:w="1941"/>
+          </w:tcPr>
+          <w:p>
+            <w:r>
+              <w:rPr>
+                <w:sz w:val="17"/>
+              </w:rPr>
+              <w:t>15,000 + 15,000</w:t>
+            </w:r>
+          </w:p>
+        </w:tc>
+        <w:tc>
+          <w:tcPr>
+            <w:tcW w:type="dxa" w:w="1941"/>
+          </w:tcPr>
+          <w:p>
+            <w:r>
+              <w:rPr>
+                <w:sz w:val="17"/>
+              </w:rPr>
+              <w:t>6.881</w:t>
+            </w:r>
+          </w:p>
+        </w:tc>
+        <w:tc>
+          <w:tcPr>
+            <w:tcW w:type="dxa" w:w="1941"/>
+          </w:tcPr>
+          <w:p>
+            <w:r>
+              <w:rPr>
+                <w:sz w:val="17"/>
+              </w:rPr>
+              <w:t>6.822</w:t>
+            </w:r>
+          </w:p>
+        </w:tc>
+        <w:tc>
+          <w:tcPr>
+            <w:tcW w:type="dxa" w:w="1941"/>
+          </w:tcPr>
+          <w:p>
+            <w:r>
+              <w:rPr>
+                <w:sz w:val="17"/>
+              </w:rPr>
+              <w:t>6.8515</w:t>
+            </w:r>
+          </w:p>
+        </w:tc>
+      </w:tr>
+    </w:tbl>
+    <w:p>
+      <w:pPr>
+        <w:jc w:val="center"/>
+      </w:pPr>
+      <w:r>
+        <w:drawing>
+          <wp:inline xmlns:a="http://schemas.openxmlformats.org/drawingml/2006/main" xmlns:pic="http://schemas.openxmlformats.org/drawingml/2006/picture">
+            <wp:extent cx="5303520" cy="2283941"/>
+            <wp:docPr id="6" name="Picture 6"/>
+            <wp:cNvGraphicFramePr>
+              <a:graphicFrameLocks noChangeAspect="1"/>
+            </wp:cNvGraphicFramePr>
+            <a:graphic>
+              <a:graphicData uri="http://schemas.openxmlformats.org/drawingml/2006/picture">
+                <pic:pic>
+                  <pic:nvPicPr>
+                    <pic:cNvPr id="0" name="DATAMARCA_5_1_P2_3x_comparacion.png"/>
+                    <pic:cNvPicPr/>
+                  </pic:nvPicPr>
+                  <pic:blipFill>
+                    <a:blip r:embed="rId15"/>
+                    <a:stretch>
+                      <a:fillRect/>
+                    </a:stretch>
+                  </pic:blipFill>
+                  <pic:spPr>
+                    <a:xfrm>
+                      <a:off x="0" y="0"/>
+                      <a:ext cx="5303520" cy="2283941"/>
+                    </a:xfrm>
+                    <a:prstGeom prst="rect"/>
+                  </pic:spPr>
+                </pic:pic>
+              </a:graphicData>
+            </a:graphic>
+          </wp:inline>
+        </w:drawing>
+      </w:r>
+    </w:p>
+    <w:p>
+      <w:pPr>
+        <w:pStyle w:val="FigureCaption"/>
+      </w:pPr>
+      <w:r>
+        <w:t>Figura A1. Comparación P2 con dos ejecuciones por escenario; tiempo total mediano en segundos.</w:t>
+      </w:r>
+    </w:p>
+    <w:p>
+      <w:r>
+        <w:t>Resultado observado. La mediana fue de 10.2155 s para 1x y 6.8515 s para 3x, una disminución relativa de 32.9 % en esta muestra. Las cuatro ejecuciones terminaron con estado ok e integrity_ok=True; coinciden los conteos de entrada y los del join, así como los montos agregados antes y después del join.</w:t>
+      </w:r>
+    </w:p>
+    <w:p>
+      <w:r>
+        <w:t>Interpretación y límites. La ejecución exitosa de 3x constituye evidencia funcional de carga ampliada del prototipo local, no una demostración de capacidad para soportar picos de producción. El tiempo menor en 3x no demuestra escalabilidad superlineal ni un beneficio causal del aumento de datos: las primeras corridas pudieron verse afectadas por calentamiento, cachés y variación del sistema. El ensayo usa patrones sintéticos repetidos, un único equipo y solo dos repeticiones por volumen; no reproduce un entorno distribuido, las cifras de 50 millones de transacciones diarias ni los objetivos de disponibilidad y costos del diseño.</w:t>
+      </w:r>
+    </w:p>
+    <w:p>
+      <w:r>
+        <w:t>Trazabilidad. Evidencia primaria: DATAMARCA_5_1_prueba_P2_3x.csv (4 corridas), generado con SHUFFLE_PARTITIONS=8 mediante src/main.py --benchmark --sizes 5000 15000 --repeats 2. La prueba se incorpora como anexo documental posterior a la campaña de 22 ejecuciones ya descrita en las secciones anteriores.</w:t>
+      </w:r>
+    </w:p>
     <w:sectPr>
       <w:footerReference w:type="default" r:id="rId9"/>
       <w:pgSz w:w="12240" w:h="15840"/>

</xml_diff>